<commit_message>
Add detailed manager onboarding runbook and company resource and shooting policies
</commit_message>
<xml_diff>
--- a/handover/PMP-Marketing-Department-Owner-Handover-SOP.docx
+++ b/handover/PMP-Marketing-Department-Owner-Handover-SOP.docx
@@ -3293,7 +3293,7 @@
     </w:p>
     <w:p>
       <w:r>
-        <w:t>Participate throughout acquisition; capture actual brief; coordinate actual strategy; distribute and monitor tasks; gather approved work in one PPTX; obtain client approval.</w:t>
+        <w:t>Participate throughout acquisition; capture brief and coordinate actual strategy; distribute/monitor work and client PPTX approvals; arrange outsourced videography/photography, podcast guests and the PR person.</w:t>
       </w:r>
     </w:p>
     <w:p>
@@ -3500,7 +3500,7 @@
     </w:p>
     <w:p>
       <w:r>
-        <w:t>Gather private-label calendars; create strategies, performance and listening reports; schedule/publish approved calendars; reply to page comments.</w:t>
+        <w:t>Gather private-label calendars; create strategy/performance/listening reports; schedule/publish approved calendars and reply to comments; collect photo/video data, hand it to editors/designers, take full accountability for memory cards and studio tools, and shoot behind-the-scenes content.</w:t>
       </w:r>
     </w:p>
     <w:p>
@@ -4248,6 +4248,215 @@
         </w:tc>
       </w:tr>
     </w:tbl>
+    <w:p>
+      <w:pPr>
+        <w:pStyle w:val="Heading1"/>
+      </w:pPr>
+      <w:r>
+        <w:t>6A. Company resources and shooting operations</w:t>
+      </w:r>
+    </w:p>
+    <w:tbl>
+      <w:tblPr>
+        <w:tblStyle w:val="TableGrid"/>
+        <w:tblW w:type="auto" w:w="0"/>
+        <w:tblLook w:firstColumn="1" w:firstRow="1" w:lastColumn="0" w:lastRow="0" w:noHBand="0" w:noVBand="1" w:val="04A0"/>
+      </w:tblPr>
+      <w:tblGrid>
+        <w:gridCol w:w="5112"/>
+        <w:gridCol w:w="5112"/>
+      </w:tblGrid>
+      <w:tr>
+        <w:trPr>
+          <w:tblHeader/>
+        </w:trPr>
+        <w:tc>
+          <w:tcPr>
+            <w:tcW w:type="dxa" w:w="5112"/>
+            <w:shd w:fill="7D2B42"/>
+          </w:tcPr>
+          <w:p>
+            <w:r>
+              <w:rPr>
+                <w:b/>
+                <w:color w:val="FFFFFF"/>
+              </w:rPr>
+              <w:t>Resource / responsibility</w:t>
+            </w:r>
+          </w:p>
+        </w:tc>
+        <w:tc>
+          <w:tcPr>
+            <w:tcW w:type="dxa" w:w="5112"/>
+            <w:shd w:fill="7D2B42"/>
+          </w:tcPr>
+          <w:p>
+            <w:r>
+              <w:rPr>
+                <w:b/>
+                <w:color w:val="FFFFFF"/>
+              </w:rPr>
+              <w:t>Confirmed rule or boundary</w:t>
+            </w:r>
+          </w:p>
+        </w:tc>
+      </w:tr>
+      <w:tr>
+        <w:trPr>
+          <w:cantSplit/>
+        </w:trPr>
+        <w:tc>
+          <w:tcPr>
+            <w:tcW w:type="dxa" w:w="5112"/>
+          </w:tcPr>
+          <w:p>
+            <w:r>
+              <w:t>Higgsfield account</w:t>
+            </w:r>
+          </w:p>
+        </w:tc>
+        <w:tc>
+          <w:tcPr>
+            <w:tcW w:type="dxa" w:w="5112"/>
+          </w:tcPr>
+          <w:p>
+            <w:r>
+              <w:t>For Video Editors VE-01 and VE-02 ONLY. Use by any other team member is forbidden; manager/owner title does not create an exception.</w:t>
+            </w:r>
+          </w:p>
+        </w:tc>
+      </w:tr>
+      <w:tr>
+        <w:trPr>
+          <w:cantSplit/>
+        </w:trPr>
+        <w:tc>
+          <w:tcPr>
+            <w:tcW w:type="dxa" w:w="5112"/>
+          </w:tcPr>
+          <w:p>
+            <w:r>
+              <w:t>Claude and ChatGPT</w:t>
+            </w:r>
+          </w:p>
+        </w:tc>
+        <w:tc>
+          <w:tcPr>
+            <w:tcW w:type="dxa" w:w="5112"/>
+          </w:tcPr>
+          <w:p>
+            <w:r>
+              <w:t>Company-provided subscriptions. Assigned seats, plans and permitted data use must be confirmed; no credentials are included here.</w:t>
+            </w:r>
+          </w:p>
+        </w:tc>
+      </w:tr>
+      <w:tr>
+        <w:trPr>
+          <w:cantSplit/>
+        </w:trPr>
+        <w:tc>
+          <w:tcPr>
+            <w:tcW w:type="dxa" w:w="5112"/>
+          </w:tcPr>
+          <w:p>
+            <w:r>
+              <w:t>Canva and Adobe programs</w:t>
+            </w:r>
+          </w:p>
+        </w:tc>
+        <w:tc>
+          <w:tcPr>
+            <w:tcW w:type="dxa" w:w="5112"/>
+          </w:tcPr>
+          <w:p>
+            <w:r>
+              <w:t>Company-provided subscriptions/software. Exact applications, seats and licence arrangements must be confirmed.</w:t>
+            </w:r>
+          </w:p>
+        </w:tc>
+      </w:tr>
+      <w:tr>
+        <w:trPr>
+          <w:cantSplit/>
+        </w:trPr>
+        <w:tc>
+          <w:tcPr>
+            <w:tcW w:type="dxa" w:w="5112"/>
+          </w:tcPr>
+          <w:p>
+            <w:r>
+              <w:t>Company hard drives</w:t>
+            </w:r>
+          </w:p>
+        </w:tc>
+        <w:tc>
+          <w:tcPr>
+            <w:tcW w:type="dxa" w:w="5112"/>
+          </w:tcPr>
+          <w:p>
+            <w:r>
+              <w:t>Several drives exist. Record each asset, contents, location and a named custodian. Custodian and backup rules were not specified; do not assume SM automatically owns every hard drive.</w:t>
+            </w:r>
+          </w:p>
+        </w:tc>
+      </w:tr>
+      <w:tr>
+        <w:trPr>
+          <w:cantSplit/>
+        </w:trPr>
+        <w:tc>
+          <w:tcPr>
+            <w:tcW w:type="dxa" w:w="5112"/>
+          </w:tcPr>
+          <w:p>
+            <w:r>
+              <w:t>Account Manager</w:t>
+            </w:r>
+          </w:p>
+        </w:tc>
+        <w:tc>
+          <w:tcPr>
+            <w:tcW w:type="dxa" w:w="5112"/>
+          </w:tcPr>
+          <w:p>
+            <w:r>
+              <w:t>Arranges outsourced videography/photography team, podcast guests and the PR person.</w:t>
+            </w:r>
+          </w:p>
+        </w:tc>
+      </w:tr>
+      <w:tr>
+        <w:trPr>
+          <w:cantSplit/>
+        </w:trPr>
+        <w:tc>
+          <w:tcPr>
+            <w:tcW w:type="dxa" w:w="5112"/>
+          </w:tcPr>
+          <w:p>
+            <w:r>
+              <w:t>Social Media Specialist</w:t>
+            </w:r>
+          </w:p>
+        </w:tc>
+        <w:tc>
+          <w:tcPr>
+            <w:tcW w:type="dxa" w:w="5112"/>
+          </w:tcPr>
+          <w:p>
+            <w:r>
+              <w:t>Collects data from videographer/photographer and hands it to editors/designers; takes full accountability for memory cards and studio tools; captures behind-the-scenes content.</w:t>
+            </w:r>
+          </w:p>
+        </w:tc>
+      </w:tr>
+    </w:tbl>
+    <w:p>
+      <w:r>
+        <w:t>Shooting handoff: AM coordinates the people and arrangements; SM collects the photo/video data, maintains accountable custody of memory cards/studio tools and transfers the relevant files/references to the assigned editor/designer. Receiver verification, asset IDs, issue/return logs, backup checks and a no-format-before-confirmed-transfer check are recommended controls requiring adoption; they are not claimed as existing company policy. No actual file transfer or equipment inventory is certified by this document.</w:t>
+      </w:r>
+    </w:p>
     <w:p>
       <w:pPr>
         <w:pStyle w:val="Heading1"/>

</xml_diff>

<commit_message>
Deliver English and Arabic operating packs with monthly appraisals
</commit_message>
<xml_diff>
--- a/handover/PMP-Marketing-Department-Owner-Handover-SOP.docx
+++ b/handover/PMP-Marketing-Department-Owner-Handover-SOP.docx
@@ -5072,6 +5072,220 @@
         <w:pStyle w:val="Heading1"/>
       </w:pPr>
       <w:r>
+        <w:t>10A. Monthly team performance appraisals</w:t>
+      </w:r>
+    </w:p>
+    <w:p>
+      <w:r>
+        <w:t>CONFIRMED cadence: complete team performance appraisals every month using the approved role-specific company forms. Exact dates, reviewer assignments, master file/version and private storage/access must be agreed. This is a people-development review, separate from client performance reporting and daily task approval.</w:t>
+      </w:r>
+    </w:p>
+    <w:p>
+      <w:r>
+        <w:t>1. Select the approved role-specific form and record employee, actual review month and confirmed direct reviewer privately. Do not infer a reviewer from coordination responsibilities.</w:t>
+      </w:r>
+    </w:p>
+    <w:p>
+      <w:r>
+        <w:t>2. Collect month-specific evidence from tasks, quality/revision records, outputs and role-appropriate results. Distinguish missing inputs or changed scope from individual execution.</w:t>
+      </w:r>
+    </w:p>
+    <w:p>
+      <w:r>
+        <w:t>3. Employee completes Self-Rating before the review meeting. Manager completes Manager Rating; compare the gap rather than assuming agreement.</w:t>
+      </w:r>
+    </w:p>
+    <w:p>
+      <w:r>
+        <w:t>4. Use the supplied 1–5 scale and behavioral anchors. Ratings 1, 2 and 5 require a brief evidence-based justification in the Notes field/section.</w:t>
+      </w:r>
+    </w:p>
+    <w:p>
+      <w:r>
+        <w:t>5. Check the role-specific weights and calculations. Supplied Excel uses Gap = Manager minus Self and weighted contribution = KPI weight × Manager Rating / 5. Confirm completion before interpreting totals: blank manager ratings are treated as zero in the supplied formulas.</w:t>
+      </w:r>
+    </w:p>
+    <w:p>
+      <w:r>
+        <w:t>6. Hold the monthly review conversation, record achievements, blockers, strengths, improvement areas and employee feedback. Track the template's quarterly OKRs within the monthly conversation; do not confuse the two cadences.</w:t>
+      </w:r>
+    </w:p>
+    <w:p>
+      <w:r>
+        <w:t>7. Agree SMART goals and development/training actions for the next period, with accountable action owners and agreed follow-up. Record the signatures/decisions required by the adopted process.</w:t>
+      </w:r>
+    </w:p>
+    <w:p>
+      <w:r>
+        <w:t>8. Keep completed appraisals and salary/career information in private authorized storage; carry goals into the following monthly review. Promotion, salary, succession and HR fields are not automatic decisions or approvals.</w:t>
+      </w:r>
+    </w:p>
+    <w:tbl>
+      <w:tblPr>
+        <w:tblStyle w:val="TableGrid"/>
+        <w:tblW w:type="auto" w:w="0"/>
+        <w:tblLook w:firstColumn="1" w:firstRow="1" w:lastColumn="0" w:lastRow="0" w:noHBand="0" w:noVBand="1" w:val="04A0"/>
+      </w:tblPr>
+      <w:tblGrid>
+        <w:gridCol w:w="5112"/>
+        <w:gridCol w:w="5112"/>
+      </w:tblGrid>
+      <w:tr>
+        <w:trPr>
+          <w:tblHeader/>
+        </w:trPr>
+        <w:tc>
+          <w:tcPr>
+            <w:tcW w:type="dxa" w:w="5112"/>
+            <w:shd w:fill="7D2B42"/>
+          </w:tcPr>
+          <w:p>
+            <w:r>
+              <w:rPr>
+                <w:b/>
+                <w:color w:val="FFFFFF"/>
+              </w:rPr>
+              <w:t>Section</w:t>
+            </w:r>
+          </w:p>
+        </w:tc>
+        <w:tc>
+          <w:tcPr>
+            <w:tcW w:type="dxa" w:w="5112"/>
+            <w:shd w:fill="7D2B42"/>
+          </w:tcPr>
+          <w:p>
+            <w:r>
+              <w:rPr>
+                <w:b/>
+                <w:color w:val="FFFFFF"/>
+              </w:rPr>
+              <w:t>Weight</w:t>
+            </w:r>
+          </w:p>
+        </w:tc>
+      </w:tr>
+      <w:tr>
+        <w:trPr>
+          <w:cantSplit/>
+        </w:trPr>
+        <w:tc>
+          <w:tcPr>
+            <w:tcW w:type="dxa" w:w="5112"/>
+          </w:tcPr>
+          <w:p>
+            <w:r>
+              <w:t>Core competencies</w:t>
+            </w:r>
+          </w:p>
+        </w:tc>
+        <w:tc>
+          <w:tcPr>
+            <w:tcW w:type="dxa" w:w="5112"/>
+          </w:tcPr>
+          <w:p>
+            <w:r>
+              <w:t>30%</w:t>
+            </w:r>
+          </w:p>
+        </w:tc>
+      </w:tr>
+      <w:tr>
+        <w:trPr>
+          <w:cantSplit/>
+        </w:trPr>
+        <w:tc>
+          <w:tcPr>
+            <w:tcW w:type="dxa" w:w="5112"/>
+          </w:tcPr>
+          <w:p>
+            <w:r>
+              <w:t>Role-specific or technical KPIs</w:t>
+            </w:r>
+          </w:p>
+        </w:tc>
+        <w:tc>
+          <w:tcPr>
+            <w:tcW w:type="dxa" w:w="5112"/>
+          </w:tcPr>
+          <w:p>
+            <w:r>
+              <w:t>50%</w:t>
+            </w:r>
+          </w:p>
+        </w:tc>
+      </w:tr>
+      <w:tr>
+        <w:trPr>
+          <w:cantSplit/>
+        </w:trPr>
+        <w:tc>
+          <w:tcPr>
+            <w:tcW w:type="dxa" w:w="5112"/>
+          </w:tcPr>
+          <w:p>
+            <w:r>
+              <w:t>Professional development</w:t>
+            </w:r>
+          </w:p>
+        </w:tc>
+        <w:tc>
+          <w:tcPr>
+            <w:tcW w:type="dxa" w:w="5112"/>
+          </w:tcPr>
+          <w:p>
+            <w:r>
+              <w:t>10%</w:t>
+            </w:r>
+          </w:p>
+        </w:tc>
+      </w:tr>
+      <w:tr>
+        <w:trPr>
+          <w:cantSplit/>
+        </w:trPr>
+        <w:tc>
+          <w:tcPr>
+            <w:tcW w:type="dxa" w:w="5112"/>
+          </w:tcPr>
+          <w:p>
+            <w:r>
+              <w:t>Company events and culture</w:t>
+            </w:r>
+          </w:p>
+        </w:tc>
+        <w:tc>
+          <w:tcPr>
+            <w:tcW w:type="dxa" w:w="5112"/>
+          </w:tcPr>
+          <w:p>
+            <w:r>
+              <w:t>10%</w:t>
+            </w:r>
+          </w:p>
+        </w:tc>
+      </w:tr>
+    </w:tbl>
+    <w:p>
+      <w:r>
+        <w:t>Source scale: 1 Poor; 2 Below Expectations; 3 Meets Expectations; 4 Exceeds Expectations; 5 Outstanding. Use supplied behavioral anchors and evidence; justify ratings 1, 2 and 5. Blank ratings must not be read as a valid completed assessment.</w:t>
+      </w:r>
+    </w:p>
+    <w:p>
+      <w:r>
+        <w:t>The supplied templates include quarterly OKRs; track them during monthly reviews rather than changing monthly appraisal cadence. Final pay, promotion and HR decisions require authorized review; they are not automatically granted by a score. No completed employee evaluations, salaries or private archive files are included in this public pack.</w:t>
+      </w:r>
+    </w:p>
+    <w:p>
+      <w:r>
+        <w:t>Open decisions: Approved master/version; mapping nine supplied role-title families to the 14 positions (including missing/combined-role cases); reviewer of Marketing Manager; final HR/owner authority; exact deadlines and private storage/access. Do not create extra staff positions or force mismatched scorecards.</w:t>
+      </w:r>
+    </w:p>
+    <w:p>
+      <w:pPr>
+        <w:pStyle w:val="Heading1"/>
+      </w:pPr>
+      <w:r>
         <w:t>11. Owner acceptance and handover checklist</w:t>
       </w:r>
     </w:p>

</xml_diff>